<commit_message>
Move orientação do aproveitamento para o formulário
</commit_message>
<xml_diff>
--- a/models/aproveitamento-experiencia-aems.docx
+++ b/models/aproveitamento-experiencia-aems.docx
@@ -1276,51 +1276,6 @@
               <w:right w:w="0" w:type="dxa"/>
             </w:tcMar>
           </w:tcPr>
-          <w:p ns2:paraId="5DF2E9D7" ns2:textId="77777777">
-            <w:pPr>
-              <w:rPr>
-                <w:highlight w:val="yellow"/>
-              </w:rPr>
-              <w:jc w:val="both"/>
-              <w:spacing w:after="120" w:line="276" w:lineRule="auto"/>
-            </w:pPr>
-            <w:r>
-              <w:rPr>
-                <w:highlight w:val="yellow"/>
-                <w:rFonts w:ascii="Arial" w:hAnsi="Arial" w:cs="Arial"/>
-                <w:sz w:val="24"/>
-                <w:szCs w:val="24"/>
-              </w:rPr>
-              <w:t xml:space="preserve">Atenção: O estudante deve apresentar uma descrição técnica e detalhada das atividades, conectando-as aos componentes curriculares do curso e especificando tecnologias, metodologias e projetos realizados. É obrigatória a construção de um relatório sólido e fundamentado, acompanhado de evidências concretas da execução das tarefas, tais como links para repositórios no GitHub, documentação técnica, diagramas de sistemas desenvolvidos ou portfólios de projetos. Toda a descrição e as evidências apresentadas devem ser validadas pela chefia imediata, comprovando a aderência das atividades profissionais ao Projeto Pedagógico do Curso (PPC) para fins de convalidação.</w:t>
-            </w:r>
-            <w:r>
-              <w:rPr>
-                <w:highlight w:val="yellow"/>
-                <w:rFonts w:ascii="Arial" w:hAnsi="Arial" w:cs="Arial"/>
-                <w:sz w:val="24"/>
-                <w:szCs w:val="24"/>
-              </w:rPr>
-              <w:t/>
-            </w:r>
-            <w:r>
-              <w:rPr>
-                <w:highlight w:val="yellow"/>
-                <w:rFonts w:ascii="Arial" w:hAnsi="Arial" w:cs="Arial"/>
-                <w:sz w:val="24"/>
-                <w:szCs w:val="24"/>
-              </w:rPr>
-              <w:t xml:space="preserve"/>
-            </w:r>
-            <w:r>
-              <w:rPr>
-                <w:highlight w:val="yellow"/>
-                <w:rFonts w:ascii="Arial" w:hAnsi="Arial" w:cs="Arial"/>
-                <w:sz w:val="24"/>
-                <w:szCs w:val="24"/>
-              </w:rPr>
-              <w:t/>
-            </w:r>
-          </w:p>
           <w:p ns2:paraId="4B01CC73" ns2:textId="77777777">
             <w:pPr>
               <w:jc w:val="both"/>

</xml_diff>

<commit_message>
Padroniza documento de aproveitamento de experiencia
</commit_message>
<xml_diff>
--- a/models/aproveitamento-experiencia-aems.docx
+++ b/models/aproveitamento-experiencia-aems.docx
@@ -4,6 +4,8 @@
   <w:body>
     <w:p ns2:paraId="1BE09E39" ns2:textId="77777777">
       <w:pPr>
+        <w:keepNext w:val="0"/>
+        <w:keepLines w:val="0"/>
         <w:pBdr>
           <w:top w:val="nil"/>
           <w:left w:val="nil"/>
@@ -11,7 +13,7 @@
           <w:right w:val="nil"/>
           <w:between w:val="nil"/>
         </w:pBdr>
-        <w:spacing w:line="360" w:lineRule="auto"/>
+        <w:spacing w:line="240" w:lineRule="auto" w:before="0" w:after="0"/>
         <w:jc w:val="center"/>
         <w:rPr>
           <w:sz w:val="28"/>
@@ -20,6 +22,8 @@
       </w:pPr>
       <w:r>
         <w:rPr>
+          <w:rFonts w:ascii="Arial" w:hAnsi="Arial"/>
+          <w:b/>
           <w:sz w:val="28"/>
           <w:szCs w:val="28"/>
         </w:rPr>
@@ -29,6 +33,9 @@
     <w:p ns2:paraId="1322BAF7" ns2:textId="77777777">
       <w:pPr>
         <w:pStyle w:val="Ttulo1"/>
+        <w:keepNext w:val="0"/>
+        <w:keepLines w:val="0"/>
+        <w:spacing w:before="0" w:after="0" w:line="240" w:lineRule="auto"/>
         <w:jc w:val="center"/>
         <w:rPr>
           <w:sz w:val="28"/>
@@ -39,7 +46,8 @@
       <w:bookmarkEnd w:id="0"/>
       <w:r>
         <w:rPr>
-          <w:sz w:val="28"/>
+          <w:b/>
+          <w:sz w:val="23"/>
           <w:szCs w:val="28"/>
           <w:rFonts w:ascii="Arial" w:hAnsi="Arial" w:cs="Arial"/>
         </w:rPr>
@@ -48,6 +56,9 @@
     </w:p>
     <w:p ns2:paraId="366B496F" ns2:textId="77777777">
       <w:pPr>
+        <w:keepNext w:val="0"/>
+        <w:keepLines w:val="0"/>
+        <w:spacing w:before="0" w:after="0" w:line="240" w:lineRule="auto"/>
         <w:rPr>
           <w:b/>
           <w:bCs/>
@@ -56,7 +67,9 @@
     </w:p>
     <w:p ns2:paraId="4CECE78A" ns2:textId="77777777">
       <w:pPr>
-        <w:spacing w:line="276" w:lineRule="auto" w:after="120"/>
+        <w:keepNext w:val="0"/>
+        <w:keepLines w:val="0"/>
+        <w:spacing w:line="240" w:lineRule="auto" w:after="0" w:before="0"/>
         <w:jc w:val="both"/>
       </w:pPr>
       <w:r>
@@ -142,7 +155,9 @@
     </w:p>
     <w:p ns2:paraId="377B6629" ns2:textId="77777777">
       <w:pPr>
-        <w:spacing w:line="276" w:lineRule="auto" w:after="120"/>
+        <w:keepNext w:val="0"/>
+        <w:keepLines w:val="0"/>
+        <w:spacing w:line="240" w:lineRule="auto" w:after="0" w:before="0"/>
         <w:jc w:val="both"/>
       </w:pPr>
       <w:r>
@@ -243,15 +258,18 @@
           <w:tcPr>
             <w:tcW w:w="4680" w:type="dxa"/>
             <w:tcMar>
-              <w:top w:w="150" w:type="dxa"/>
+              <w:top w:w="100" w:type="dxa"/>
               <w:left w:w="150" w:type="dxa"/>
-              <w:bottom w:w="150" w:type="dxa"/>
+              <w:bottom w:w="100" w:type="dxa"/>
               <w:right w:w="150" w:type="dxa"/>
+              <w:start w:w="100" w:type="dxa"/>
+              <w:end w:w="100" w:type="dxa"/>
             </w:tcMar>
+            <w:vAlign w:val="center"/>
           </w:tcPr>
           <w:p ns2:paraId="140B023F" ns2:textId="77777777">
             <w:pPr>
-              <w:spacing w:before="150" w:after="150"/>
+              <w:spacing w:before="0" w:after="0" w:line="240" w:lineRule="auto"/>
               <w:rPr>
                 <w:b/>
                 <w:bCs/>
@@ -259,8 +277,10 @@
             </w:pPr>
             <w:r>
               <w:rPr>
+                <w:rFonts w:ascii="Arial" w:hAnsi="Arial"/>
                 <w:b/>
                 <w:bCs/>
+                <w:sz w:val="21"/>
               </w:rPr>
               <w:t>Nome do Chefe Imediato:</w:t>
             </w:r>
@@ -270,15 +290,18 @@
           <w:tcPr>
             <w:tcW w:w="4680" w:type="dxa"/>
             <w:tcMar>
-              <w:top w:w="150" w:type="dxa"/>
+              <w:top w:w="100" w:type="dxa"/>
               <w:left w:w="150" w:type="dxa"/>
-              <w:bottom w:w="150" w:type="dxa"/>
+              <w:bottom w:w="100" w:type="dxa"/>
               <w:right w:w="150" w:type="dxa"/>
+              <w:start w:w="100" w:type="dxa"/>
+              <w:end w:w="100" w:type="dxa"/>
             </w:tcMar>
+            <w:vAlign w:val="center"/>
           </w:tcPr>
           <w:p ns2:paraId="0561EC14" ns2:textId="77777777">
             <w:pPr>
-              <w:spacing w:before="150" w:after="150"/>
+              <w:spacing w:before="0" w:after="0" w:line="240" w:lineRule="auto"/>
             </w:pPr>
             <w:r>
               <w:rPr>
@@ -296,15 +319,18 @@
           <w:tcPr>
             <w:tcW w:w="4680" w:type="dxa"/>
             <w:tcMar>
-              <w:top w:w="150" w:type="dxa"/>
+              <w:top w:w="100" w:type="dxa"/>
               <w:left w:w="150" w:type="dxa"/>
-              <w:bottom w:w="150" w:type="dxa"/>
+              <w:bottom w:w="100" w:type="dxa"/>
               <w:right w:w="150" w:type="dxa"/>
+              <w:start w:w="100" w:type="dxa"/>
+              <w:end w:w="100" w:type="dxa"/>
             </w:tcMar>
+            <w:vAlign w:val="center"/>
           </w:tcPr>
           <w:p ns2:paraId="5D8F7EE2" ns2:textId="77777777">
             <w:pPr>
-              <w:spacing w:before="150" w:after="150"/>
+              <w:spacing w:before="0" w:after="0" w:line="240" w:lineRule="auto"/>
               <w:rPr>
                 <w:b/>
                 <w:bCs/>
@@ -312,8 +338,10 @@
             </w:pPr>
             <w:r>
               <w:rPr>
+                <w:rFonts w:ascii="Arial" w:hAnsi="Arial"/>
                 <w:b/>
                 <w:bCs/>
+                <w:sz w:val="21"/>
               </w:rPr>
               <w:t>Cargo do Chefe Imediato:</w:t>
             </w:r>
@@ -323,15 +351,18 @@
           <w:tcPr>
             <w:tcW w:w="4680" w:type="dxa"/>
             <w:tcMar>
-              <w:top w:w="150" w:type="dxa"/>
+              <w:top w:w="100" w:type="dxa"/>
               <w:left w:w="150" w:type="dxa"/>
-              <w:bottom w:w="150" w:type="dxa"/>
+              <w:bottom w:w="100" w:type="dxa"/>
               <w:right w:w="150" w:type="dxa"/>
+              <w:start w:w="100" w:type="dxa"/>
+              <w:end w:w="100" w:type="dxa"/>
             </w:tcMar>
+            <w:vAlign w:val="center"/>
           </w:tcPr>
           <w:p ns2:paraId="65039085" ns2:textId="77777777">
             <w:pPr>
-              <w:spacing w:before="150" w:after="150"/>
+              <w:spacing w:before="0" w:after="0" w:line="240" w:lineRule="auto"/>
             </w:pPr>
             <w:r>
               <w:rPr>
@@ -349,15 +380,18 @@
           <w:tcPr>
             <w:tcW w:w="4680" w:type="dxa"/>
             <w:tcMar>
-              <w:top w:w="150" w:type="dxa"/>
+              <w:top w:w="100" w:type="dxa"/>
               <w:left w:w="150" w:type="dxa"/>
-              <w:bottom w:w="150" w:type="dxa"/>
+              <w:bottom w:w="100" w:type="dxa"/>
               <w:right w:w="150" w:type="dxa"/>
+              <w:start w:w="100" w:type="dxa"/>
+              <w:end w:w="100" w:type="dxa"/>
             </w:tcMar>
+            <w:vAlign w:val="center"/>
           </w:tcPr>
           <w:p ns2:paraId="3992F0FB" ns2:textId="77777777">
             <w:pPr>
-              <w:spacing w:before="150" w:after="150"/>
+              <w:spacing w:before="0" w:after="0" w:line="240" w:lineRule="auto"/>
               <w:rPr>
                 <w:b/>
                 <w:bCs/>
@@ -365,8 +399,10 @@
             </w:pPr>
             <w:r>
               <w:rPr>
+                <w:rFonts w:ascii="Arial" w:hAnsi="Arial"/>
                 <w:b/>
                 <w:bCs/>
+                <w:sz w:val="21"/>
               </w:rPr>
               <w:t>E-mail de Contato:</w:t>
             </w:r>
@@ -376,15 +412,18 @@
           <w:tcPr>
             <w:tcW w:w="4680" w:type="dxa"/>
             <w:tcMar>
-              <w:top w:w="150" w:type="dxa"/>
+              <w:top w:w="100" w:type="dxa"/>
               <w:left w:w="150" w:type="dxa"/>
-              <w:bottom w:w="150" w:type="dxa"/>
+              <w:bottom w:w="100" w:type="dxa"/>
               <w:right w:w="150" w:type="dxa"/>
+              <w:start w:w="100" w:type="dxa"/>
+              <w:end w:w="100" w:type="dxa"/>
             </w:tcMar>
+            <w:vAlign w:val="center"/>
           </w:tcPr>
           <w:p ns2:paraId="5533AB98" ns2:textId="77777777">
             <w:pPr>
-              <w:spacing w:before="150" w:after="150"/>
+              <w:spacing w:before="0" w:after="0" w:line="240" w:lineRule="auto"/>
             </w:pPr>
             <w:r>
               <w:rPr>
@@ -402,15 +441,18 @@
           <w:tcPr>
             <w:tcW w:w="4680" w:type="dxa"/>
             <w:tcMar>
-              <w:top w:w="150" w:type="dxa"/>
+              <w:top w:w="100" w:type="dxa"/>
               <w:left w:w="150" w:type="dxa"/>
-              <w:bottom w:w="150" w:type="dxa"/>
+              <w:bottom w:w="100" w:type="dxa"/>
               <w:right w:w="150" w:type="dxa"/>
+              <w:start w:w="100" w:type="dxa"/>
+              <w:end w:w="100" w:type="dxa"/>
             </w:tcMar>
+            <w:vAlign w:val="center"/>
           </w:tcPr>
           <w:p ns2:paraId="5FF359EA" ns2:textId="77777777">
             <w:pPr>
-              <w:spacing w:before="150" w:after="150"/>
+              <w:spacing w:before="0" w:after="0" w:line="240" w:lineRule="auto"/>
               <w:rPr>
                 <w:b/>
                 <w:bCs/>
@@ -418,8 +460,10 @@
             </w:pPr>
             <w:r>
               <w:rPr>
+                <w:rFonts w:ascii="Arial" w:hAnsi="Arial"/>
                 <w:b/>
                 <w:bCs/>
+                <w:sz w:val="21"/>
               </w:rPr>
               <w:t>Telefone Direto:</w:t>
             </w:r>
@@ -429,15 +473,18 @@
           <w:tcPr>
             <w:tcW w:w="4680" w:type="dxa"/>
             <w:tcMar>
-              <w:top w:w="150" w:type="dxa"/>
+              <w:top w:w="100" w:type="dxa"/>
               <w:left w:w="150" w:type="dxa"/>
-              <w:bottom w:w="150" w:type="dxa"/>
+              <w:bottom w:w="100" w:type="dxa"/>
               <w:right w:w="150" w:type="dxa"/>
+              <w:start w:w="100" w:type="dxa"/>
+              <w:end w:w="100" w:type="dxa"/>
             </w:tcMar>
+            <w:vAlign w:val="center"/>
           </w:tcPr>
           <w:p ns2:paraId="15CD4B17" ns2:textId="77777777">
             <w:pPr>
-              <w:spacing w:before="150" w:after="150"/>
+              <w:spacing w:before="0" w:after="0" w:line="240" w:lineRule="auto"/>
             </w:pPr>
             <w:r>
               <w:rPr>
@@ -451,10 +498,18 @@
         </w:tc>
       </w:tr>
     </w:tbl>
-    <w:p ns2:paraId="7947EED9" ns2:textId="77777777"/>
+    <w:p ns2:paraId="7947EED9" ns2:textId="77777777">
+      <w:pPr>
+        <w:keepNext w:val="0"/>
+        <w:keepLines w:val="0"/>
+        <w:spacing w:before="0" w:after="0" w:line="240" w:lineRule="auto"/>
+      </w:pPr>
+    </w:p>
     <w:p ns2:paraId="57A30154" ns2:textId="77777777">
       <w:pPr>
-        <w:spacing w:line="276" w:lineRule="auto" w:after="120"/>
+        <w:keepNext w:val="0"/>
+        <w:keepLines w:val="0"/>
+        <w:spacing w:line="240" w:lineRule="auto" w:after="0" w:before="0"/>
         <w:jc w:val="both"/>
       </w:pPr>
       <w:r>
@@ -466,10 +521,25 @@
         <w:t xml:space="preserve">Confirmamos que as atividades descritas pelo estudante no requerimento de aproveitamento são verídicas e condizentes com a rotina de trabalho estabelecida nesta unidade.</w:t>
       </w:r>
     </w:p>
-    <w:p ns2:paraId="2376CF28" ns2:textId="77777777"/>
-    <w:p ns2:paraId="1FF5EAA1" ns2:textId="77777777"/>
+    <w:p ns2:paraId="2376CF28" ns2:textId="77777777">
+      <w:pPr>
+        <w:keepNext w:val="0"/>
+        <w:keepLines w:val="0"/>
+        <w:spacing w:before="0" w:after="0" w:line="240" w:lineRule="auto"/>
+      </w:pPr>
+    </w:p>
+    <w:p ns2:paraId="1FF5EAA1" ns2:textId="77777777">
+      <w:pPr>
+        <w:keepNext w:val="0"/>
+        <w:keepLines w:val="0"/>
+        <w:spacing w:before="0" w:after="0" w:line="240" w:lineRule="auto"/>
+      </w:pPr>
+    </w:p>
     <w:p ns2:paraId="3836E5B3" ns2:textId="77777777">
       <w:pPr>
+        <w:keepNext w:val="0"/>
+        <w:keepLines w:val="0"/>
+        <w:spacing w:before="0" w:after="0" w:line="240" w:lineRule="auto"/>
         <w:jc w:val="right"/>
       </w:pPr>
       <w:r>
@@ -489,24 +559,82 @@
         <w:t/>
       </w:r>
     </w:p>
-    <w:p ns2:paraId="2D16DB3F" ns2:textId="77777777"/>
-    <w:p ns2:paraId="60E5C3D8" ns2:textId="77777777"/>
-    <w:p ns2:paraId="69972C01" ns2:textId="77777777"/>
-    <w:p ns2:paraId="678009D6" ns2:textId="77777777"/>
-    <w:p ns2:paraId="36065107" ns2:textId="77777777"/>
-    <w:p ns2:paraId="2B5F3DCE" ns2:textId="77777777"/>
-    <w:p ns2:paraId="7FD2CD84" ns2:textId="77777777"/>
-    <w:p ns2:paraId="55233E4F" ns2:textId="77777777"/>
+    <w:p ns2:paraId="2D16DB3F" ns2:textId="77777777">
+      <w:pPr>
+        <w:keepNext w:val="0"/>
+        <w:keepLines w:val="0"/>
+        <w:spacing w:before="0" w:after="0" w:line="240" w:lineRule="auto"/>
+      </w:pPr>
+    </w:p>
+    <w:p ns2:paraId="60E5C3D8" ns2:textId="77777777">
+      <w:pPr>
+        <w:keepNext w:val="0"/>
+        <w:keepLines w:val="0"/>
+        <w:spacing w:before="0" w:after="0" w:line="240" w:lineRule="auto"/>
+      </w:pPr>
+    </w:p>
+    <w:p ns2:paraId="69972C01" ns2:textId="77777777">
+      <w:pPr>
+        <w:keepNext w:val="0"/>
+        <w:keepLines w:val="0"/>
+        <w:spacing w:before="0" w:after="0" w:line="240" w:lineRule="auto"/>
+      </w:pPr>
+    </w:p>
+    <w:p ns2:paraId="678009D6" ns2:textId="77777777">
+      <w:pPr>
+        <w:keepNext w:val="0"/>
+        <w:keepLines w:val="0"/>
+        <w:spacing w:before="0" w:after="0" w:line="240" w:lineRule="auto"/>
+      </w:pPr>
+    </w:p>
+    <w:p ns2:paraId="36065107" ns2:textId="77777777">
+      <w:pPr>
+        <w:keepNext w:val="0"/>
+        <w:keepLines w:val="0"/>
+        <w:spacing w:before="0" w:after="0" w:line="240" w:lineRule="auto"/>
+      </w:pPr>
+    </w:p>
+    <w:p ns2:paraId="2B5F3DCE" ns2:textId="77777777">
+      <w:pPr>
+        <w:keepNext w:val="0"/>
+        <w:keepLines w:val="0"/>
+        <w:spacing w:before="0" w:after="0" w:line="240" w:lineRule="auto"/>
+      </w:pPr>
+    </w:p>
+    <w:p ns2:paraId="7FD2CD84" ns2:textId="77777777">
+      <w:pPr>
+        <w:keepNext w:val="0"/>
+        <w:keepLines w:val="0"/>
+        <w:spacing w:before="0" w:after="0" w:line="240" w:lineRule="auto"/>
+      </w:pPr>
+    </w:p>
+    <w:p ns2:paraId="55233E4F" ns2:textId="77777777">
+      <w:pPr>
+        <w:keepNext w:val="0"/>
+        <w:keepLines w:val="0"/>
+        <w:spacing w:before="0" w:after="0" w:line="240" w:lineRule="auto"/>
+      </w:pPr>
+    </w:p>
     <w:p ns2:paraId="441A3231" ns2:textId="77777777">
       <w:pPr>
+        <w:keepNext w:val="0"/>
+        <w:keepLines w:val="0"/>
+        <w:spacing w:before="0" w:after="0" w:line="240" w:lineRule="auto"/>
         <w:jc w:val="center"/>
       </w:pPr>
       <w:r>
+        <w:rPr>
+          <w:rFonts w:ascii="Arial" w:hAnsi="Arial"/>
+          <w:sz w:val="21"/>
+        </w:rPr>
         <w:t>_________________________________________________</w:t>
       </w:r>
     </w:p>
     <w:p ns2:paraId="3C04654E" ns2:textId="77777777">
       <w:pPr>
+        <w:keepNext w:val="0"/>
+        <w:keepLines w:val="0"/>
+        <w:spacing w:before="0" w:after="0" w:line="240" w:lineRule="auto"/>
         <w:jc w:val="center"/>
         <w:rPr>
           <w:b/>
@@ -515,14 +643,19 @@
       </w:pPr>
       <w:r>
         <w:rPr>
+          <w:rFonts w:ascii="Arial" w:hAnsi="Arial"/>
           <w:b/>
           <w:bCs/>
+          <w:sz w:val="21"/>
         </w:rPr>
         <w:t>Assinatura e Carimbo</w:t>
       </w:r>
     </w:p>
     <w:p ns2:paraId="0FAF4392" ns2:textId="77777777">
       <w:pPr>
+        <w:keepNext w:val="0"/>
+        <w:keepLines w:val="0"/>
+        <w:spacing w:before="0" w:after="0" w:line="240" w:lineRule="auto"/>
         <w:jc w:val="center"/>
       </w:pPr>
       <w:r>
@@ -536,7 +669,9 @@
     </w:p>
     <w:p ns2:paraId="002502F0" ns2:textId="77777777">
       <w:pPr>
-        <w:spacing w:line="360" w:lineRule="auto"/>
+        <w:keepNext w:val="0"/>
+        <w:keepLines w:val="0"/>
+        <w:spacing w:line="240" w:lineRule="auto" w:before="0" w:after="0"/>
         <w:jc w:val="center"/>
         <w:rPr>
           <w:sz w:val="28"/>
@@ -546,7 +681,9 @@
     </w:p>
     <w:p ns2:paraId="51BFF089" ns2:textId="184A9439">
       <w:pPr>
-        <w:spacing w:line="360" w:lineRule="auto"/>
+        <w:keepNext w:val="0"/>
+        <w:keepLines w:val="0"/>
+        <w:spacing w:line="240" w:lineRule="auto" w:before="0" w:after="0"/>
         <w:jc w:val="center"/>
         <w:rPr>
           <w:sz w:val="24"/>
@@ -555,7 +692,9 @@
       </w:pPr>
       <w:r>
         <w:rPr>
-          <w:sz w:val="28"/>
+          <w:rFonts w:ascii="Arial" w:hAnsi="Arial"/>
+          <w:b/>
+          <w:sz w:val="23"/>
           <w:szCs w:val="28"/>
         </w:rPr>
         <w:lastRenderedPageBreak/>
@@ -565,6 +704,9 @@
     <w:p ns2:paraId="4B7B8FF6" ns2:textId="77777777">
       <w:pPr>
         <w:pStyle w:val="Ttulo1"/>
+        <w:keepNext w:val="0"/>
+        <w:keepLines w:val="0"/>
+        <w:spacing w:before="0" w:after="0" w:line="240" w:lineRule="auto"/>
         <w:jc w:val="center"/>
         <w:rPr>
           <w:sz w:val="24"/>
@@ -573,7 +715,8 @@
       </w:pPr>
       <w:r>
         <w:rPr>
-          <w:sz w:val="24"/>
+          <w:b/>
+          <w:sz w:val="22"/>
           <w:szCs w:val="24"/>
           <w:rFonts w:ascii="Arial" w:hAnsi="Arial" w:cs="Arial"/>
         </w:rPr>
@@ -610,14 +753,19 @@
             <w:gridSpan w:val="2"/>
             <w:shd w:val="clear" w:color="auto" w:fill="F2F2F2"/>
             <w:tcMar>
-              <w:top w:w="0" w:type="dxa"/>
+              <w:top w:w="100" w:type="dxa"/>
               <w:left w:w="0" w:type="dxa"/>
-              <w:bottom w:w="0" w:type="dxa"/>
+              <w:bottom w:w="100" w:type="dxa"/>
               <w:right w:w="0" w:type="dxa"/>
+              <w:start w:w="100" w:type="dxa"/>
+              <w:end w:w="100" w:type="dxa"/>
             </w:tcMar>
+            <w:vAlign w:val="center"/>
           </w:tcPr>
           <w:p ns2:paraId="5E4EA230" ns2:textId="77777777">
-            <w:pPr/>
+            <w:pPr>
+              <w:spacing w:before="0" w:after="0" w:line="240" w:lineRule="auto"/>
+            </w:pPr>
             <w:r>
               <w:rPr>
                 <w:rFonts w:ascii="Arial" w:hAnsi="Arial" w:cs="Arial"/>
@@ -635,14 +783,19 @@
             <w:tcW w:w="9360" w:type="dxa"/>
             <w:gridSpan w:val="2"/>
             <w:tcMar>
-              <w:top w:w="0" w:type="dxa"/>
+              <w:top w:w="100" w:type="dxa"/>
               <w:left w:w="0" w:type="dxa"/>
-              <w:bottom w:w="0" w:type="dxa"/>
+              <w:bottom w:w="100" w:type="dxa"/>
               <w:right w:w="0" w:type="dxa"/>
+              <w:start w:w="100" w:type="dxa"/>
+              <w:end w:w="100" w:type="dxa"/>
             </w:tcMar>
+            <w:vAlign w:val="center"/>
           </w:tcPr>
           <w:p ns2:paraId="645E0F2F" ns2:textId="77777777">
-            <w:pPr/>
+            <w:pPr>
+              <w:spacing w:before="0" w:after="0" w:line="240" w:lineRule="auto"/>
+            </w:pPr>
             <w:r>
               <w:rPr>
                 <w:rFonts w:ascii="Arial" w:hAnsi="Arial" w:cs="Arial"/>
@@ -659,14 +812,19 @@
           <w:tcPr>
             <w:tcW w:w="4680" w:type="dxa"/>
             <w:tcMar>
-              <w:top w:w="0" w:type="dxa"/>
+              <w:top w:w="100" w:type="dxa"/>
               <w:left w:w="0" w:type="dxa"/>
-              <w:bottom w:w="0" w:type="dxa"/>
+              <w:bottom w:w="100" w:type="dxa"/>
               <w:right w:w="0" w:type="dxa"/>
+              <w:start w:w="100" w:type="dxa"/>
+              <w:end w:w="100" w:type="dxa"/>
             </w:tcMar>
+            <w:vAlign w:val="center"/>
           </w:tcPr>
           <w:p ns2:paraId="58EE927C" ns2:textId="77777777">
-            <w:pPr/>
+            <w:pPr>
+              <w:spacing w:before="0" w:after="0" w:line="240" w:lineRule="auto"/>
+            </w:pPr>
             <w:r>
               <w:rPr>
                 <w:rFonts w:ascii="Arial" w:hAnsi="Arial" w:cs="Arial"/>
@@ -681,14 +839,19 @@
           <w:tcPr>
             <w:tcW w:w="4680" w:type="dxa"/>
             <w:tcMar>
-              <w:top w:w="0" w:type="dxa"/>
+              <w:top w:w="100" w:type="dxa"/>
               <w:left w:w="0" w:type="dxa"/>
-              <w:bottom w:w="0" w:type="dxa"/>
+              <w:bottom w:w="100" w:type="dxa"/>
               <w:right w:w="0" w:type="dxa"/>
+              <w:start w:w="100" w:type="dxa"/>
+              <w:end w:w="100" w:type="dxa"/>
             </w:tcMar>
+            <w:vAlign w:val="center"/>
           </w:tcPr>
           <w:p ns2:paraId="53767D15" ns2:textId="77777777">
-            <w:pPr/>
+            <w:pPr>
+              <w:spacing w:before="0" w:after="0" w:line="240" w:lineRule="auto"/>
+            </w:pPr>
             <w:r>
               <w:rPr>
                 <w:rFonts w:ascii="Arial" w:hAnsi="Arial" w:cs="Arial"/>
@@ -705,14 +868,19 @@
           <w:tcPr>
             <w:tcW w:w="4680" w:type="dxa"/>
             <w:tcMar>
-              <w:top w:w="0" w:type="dxa"/>
+              <w:top w:w="100" w:type="dxa"/>
               <w:left w:w="0" w:type="dxa"/>
-              <w:bottom w:w="0" w:type="dxa"/>
+              <w:bottom w:w="100" w:type="dxa"/>
               <w:right w:w="0" w:type="dxa"/>
+              <w:start w:w="100" w:type="dxa"/>
+              <w:end w:w="100" w:type="dxa"/>
             </w:tcMar>
+            <w:vAlign w:val="center"/>
           </w:tcPr>
           <w:p ns2:paraId="14DD37FC" ns2:textId="77777777">
-            <w:pPr/>
+            <w:pPr>
+              <w:spacing w:before="0" w:after="0" w:line="240" w:lineRule="auto"/>
+            </w:pPr>
             <w:r>
               <w:rPr>
                 <w:rFonts w:ascii="Arial" w:hAnsi="Arial" w:cs="Arial"/>
@@ -727,14 +895,19 @@
           <w:tcPr>
             <w:tcW w:w="4680" w:type="dxa"/>
             <w:tcMar>
-              <w:top w:w="0" w:type="dxa"/>
+              <w:top w:w="100" w:type="dxa"/>
               <w:left w:w="0" w:type="dxa"/>
-              <w:bottom w:w="0" w:type="dxa"/>
+              <w:bottom w:w="100" w:type="dxa"/>
               <w:right w:w="0" w:type="dxa"/>
+              <w:start w:w="100" w:type="dxa"/>
+              <w:end w:w="100" w:type="dxa"/>
             </w:tcMar>
+            <w:vAlign w:val="center"/>
           </w:tcPr>
           <w:p ns2:paraId="05B97B64" ns2:textId="77777777">
-            <w:pPr/>
+            <w:pPr>
+              <w:spacing w:before="0" w:after="0" w:line="240" w:lineRule="auto"/>
+            </w:pPr>
             <w:r>
               <w:rPr>
                 <w:rFonts w:ascii="Arial" w:hAnsi="Arial" w:cs="Arial"/>
@@ -751,14 +924,19 @@
           <w:tcPr>
             <w:tcW w:w="4680" w:type="dxa"/>
             <w:tcMar>
-              <w:top w:w="0" w:type="dxa"/>
+              <w:top w:w="100" w:type="dxa"/>
               <w:left w:w="0" w:type="dxa"/>
-              <w:bottom w:w="0" w:type="dxa"/>
+              <w:bottom w:w="100" w:type="dxa"/>
               <w:right w:w="0" w:type="dxa"/>
+              <w:start w:w="100" w:type="dxa"/>
+              <w:end w:w="100" w:type="dxa"/>
             </w:tcMar>
+            <w:vAlign w:val="center"/>
           </w:tcPr>
           <w:p ns2:paraId="467935EB" ns2:textId="77777777">
-            <w:pPr/>
+            <w:pPr>
+              <w:spacing w:before="0" w:after="0" w:line="240" w:lineRule="auto"/>
+            </w:pPr>
             <w:r>
               <w:rPr>
                 <w:rFonts w:ascii="Arial" w:hAnsi="Arial" w:cs="Arial"/>
@@ -773,14 +951,19 @@
           <w:tcPr>
             <w:tcW w:w="4680" w:type="dxa"/>
             <w:tcMar>
-              <w:top w:w="0" w:type="dxa"/>
+              <w:top w:w="100" w:type="dxa"/>
               <w:left w:w="0" w:type="dxa"/>
-              <w:bottom w:w="0" w:type="dxa"/>
+              <w:bottom w:w="100" w:type="dxa"/>
               <w:right w:w="0" w:type="dxa"/>
+              <w:start w:w="100" w:type="dxa"/>
+              <w:end w:w="100" w:type="dxa"/>
             </w:tcMar>
+            <w:vAlign w:val="center"/>
           </w:tcPr>
           <w:p ns2:paraId="33164F10" ns2:textId="77777777">
-            <w:pPr/>
+            <w:pPr>
+              <w:spacing w:before="0" w:after="0" w:line="240" w:lineRule="auto"/>
+            </w:pPr>
             <w:r>
               <w:rPr>
                 <w:rFonts w:ascii="Arial" w:hAnsi="Arial" w:cs="Arial"/>
@@ -798,14 +981,19 @@
             <w:tcW w:w="9360" w:type="dxa"/>
             <w:gridSpan w:val="2"/>
             <w:tcMar>
-              <w:top w:w="0" w:type="dxa"/>
+              <w:top w:w="100" w:type="dxa"/>
               <w:left w:w="0" w:type="dxa"/>
-              <w:bottom w:w="0" w:type="dxa"/>
+              <w:bottom w:w="100" w:type="dxa"/>
               <w:right w:w="0" w:type="dxa"/>
+              <w:start w:w="100" w:type="dxa"/>
+              <w:end w:w="100" w:type="dxa"/>
             </w:tcMar>
+            <w:vAlign w:val="center"/>
           </w:tcPr>
           <w:p ns2:paraId="39C997DD" ns2:textId="77777777">
-            <w:pPr/>
+            <w:pPr>
+              <w:spacing w:before="0" w:after="0" w:line="240" w:lineRule="auto"/>
+            </w:pPr>
             <w:r>
               <w:rPr>
                 <w:rFonts w:ascii="Arial" w:hAnsi="Arial" w:cs="Arial"/>
@@ -844,7 +1032,13 @@
         </w:tc>
       </w:tr>
     </w:tbl>
-    <w:p ns2:paraId="2C00B128" ns2:textId="77777777"/>
+    <w:p ns2:paraId="2C00B128" ns2:textId="77777777">
+      <w:pPr>
+        <w:keepNext w:val="0"/>
+        <w:keepLines w:val="0"/>
+        <w:spacing w:before="0" w:after="0" w:line="240" w:lineRule="auto"/>
+      </w:pPr>
+    </w:p>
     <w:tbl>
       <w:tblPr>
         <w:tblStyle w:val="a2"/>
@@ -873,14 +1067,19 @@
             <w:tcW w:w="9360" w:type="dxa"/>
             <w:shd w:val="clear" w:color="auto" w:fill="F2F2F2"/>
             <w:tcMar>
-              <w:top w:w="0" w:type="dxa"/>
+              <w:top w:w="100" w:type="dxa"/>
               <w:left w:w="0" w:type="dxa"/>
-              <w:bottom w:w="0" w:type="dxa"/>
+              <w:bottom w:w="100" w:type="dxa"/>
               <w:right w:w="0" w:type="dxa"/>
+              <w:start w:w="100" w:type="dxa"/>
+              <w:end w:w="100" w:type="dxa"/>
             </w:tcMar>
+            <w:vAlign w:val="center"/>
           </w:tcPr>
           <w:p ns2:paraId="319928D1" ns2:textId="77777777">
-            <w:pPr/>
+            <w:pPr>
+              <w:spacing w:before="0" w:after="0" w:line="240" w:lineRule="auto"/>
+            </w:pPr>
             <w:r>
               <w:rPr>
                 <w:rFonts w:ascii="Arial" w:hAnsi="Arial" w:cs="Arial"/>
@@ -897,21 +1096,25 @@
           <w:tcPr>
             <w:tcW w:w="9360" w:type="dxa"/>
             <w:tcMar>
-              <w:top w:w="0" w:type="dxa"/>
+              <w:top w:w="100" w:type="dxa"/>
               <w:left w:w="0" w:type="dxa"/>
-              <w:bottom w:w="0" w:type="dxa"/>
+              <w:bottom w:w="100" w:type="dxa"/>
               <w:right w:w="0" w:type="dxa"/>
+              <w:start w:w="100" w:type="dxa"/>
+              <w:end w:w="100" w:type="dxa"/>
             </w:tcMar>
+            <w:vAlign w:val="center"/>
           </w:tcPr>
           <w:p ns2:paraId="65320E6F" ns2:textId="77777777">
-            <w:pPr/>
-            <w:r>
-              <w:rPr>
-                <w:rFonts w:ascii="Arial" w:hAnsi="Arial" w:cs="Arial"/>
-                <w:sz w:val="24"/>
-                <w:szCs w:val="24"/>
-              </w:rPr>
-              <w:t xml:space="preserve">?rea / Setor / Departamento: {{setor_profissional}}</w:t>
+            <w:pPr>
+              <w:spacing w:before="0" w:after="0" w:line="240" w:lineRule="auto"/>
+            </w:pPr>
+            <w:r>
+              <w:rPr>
+                <w:rFonts w:ascii="Arial" w:hAnsi="Arial"/>
+                <w:sz w:val="21"/>
+              </w:rPr>
+              <w:t>Área / Setor / Departamento: {{setor_profissional}}</w:t>
             </w:r>
           </w:p>
         </w:tc>
@@ -921,14 +1124,19 @@
           <w:tcPr>
             <w:tcW w:w="9360" w:type="dxa"/>
             <w:tcMar>
-              <w:top w:w="0" w:type="dxa"/>
+              <w:top w:w="100" w:type="dxa"/>
               <w:left w:w="0" w:type="dxa"/>
-              <w:bottom w:w="0" w:type="dxa"/>
+              <w:bottom w:w="100" w:type="dxa"/>
               <w:right w:w="0" w:type="dxa"/>
+              <w:start w:w="100" w:type="dxa"/>
+              <w:end w:w="100" w:type="dxa"/>
             </w:tcMar>
+            <w:vAlign w:val="center"/>
           </w:tcPr>
           <w:p ns2:paraId="30ABBD3B" ns2:textId="77777777">
-            <w:pPr/>
+            <w:pPr>
+              <w:spacing w:before="0" w:after="0" w:line="240" w:lineRule="auto"/>
+            </w:pPr>
             <w:r>
               <w:rPr>
                 <w:rFonts w:ascii="Arial" w:hAnsi="Arial" w:cs="Arial"/>
@@ -945,14 +1153,19 @@
           <w:tcPr>
             <w:tcW w:w="9360" w:type="dxa"/>
             <w:tcMar>
-              <w:top w:w="0" w:type="dxa"/>
+              <w:top w:w="100" w:type="dxa"/>
               <w:left w:w="0" w:type="dxa"/>
-              <w:bottom w:w="0" w:type="dxa"/>
+              <w:bottom w:w="100" w:type="dxa"/>
               <w:right w:w="0" w:type="dxa"/>
+              <w:start w:w="100" w:type="dxa"/>
+              <w:end w:w="100" w:type="dxa"/>
             </w:tcMar>
+            <w:vAlign w:val="center"/>
           </w:tcPr>
           <w:p ns2:paraId="2E3A65A1" ns2:textId="77777777">
-            <w:pPr/>
+            <w:pPr>
+              <w:spacing w:before="0" w:after="0" w:line="240" w:lineRule="auto"/>
+            </w:pPr>
             <w:r>
               <w:rPr>
                 <w:rFonts w:ascii="Arial" w:hAnsi="Arial" w:cs="Arial"/>
@@ -965,7 +1178,13 @@
         </w:tc>
       </w:tr>
     </w:tbl>
-    <w:p ns2:paraId="369BB7DF" ns2:textId="77777777"/>
+    <w:p ns2:paraId="369BB7DF" ns2:textId="77777777">
+      <w:pPr>
+        <w:keepNext w:val="0"/>
+        <w:keepLines w:val="0"/>
+        <w:spacing w:before="0" w:after="0" w:line="240" w:lineRule="auto"/>
+      </w:pPr>
+    </w:p>
     <w:tbl>
       <w:tblPr>
         <w:tblStyle w:val="a3"/>
@@ -996,14 +1215,19 @@
             <w:gridSpan w:val="2"/>
             <w:shd w:val="clear" w:color="auto" w:fill="F2F2F2"/>
             <w:tcMar>
-              <w:top w:w="0" w:type="dxa"/>
+              <w:top w:w="100" w:type="dxa"/>
               <w:left w:w="0" w:type="dxa"/>
-              <w:bottom w:w="0" w:type="dxa"/>
+              <w:bottom w:w="100" w:type="dxa"/>
               <w:right w:w="0" w:type="dxa"/>
+              <w:start w:w="100" w:type="dxa"/>
+              <w:end w:w="100" w:type="dxa"/>
             </w:tcMar>
+            <w:vAlign w:val="center"/>
           </w:tcPr>
           <w:p ns2:paraId="0EE9B9EF" ns2:textId="77777777">
-            <w:pPr/>
+            <w:pPr>
+              <w:spacing w:before="0" w:after="0" w:line="240" w:lineRule="auto"/>
+            </w:pPr>
             <w:r>
               <w:rPr>
                 <w:rFonts w:ascii="Arial" w:hAnsi="Arial" w:cs="Arial"/>
@@ -1029,14 +1253,19 @@
             <w:tcW w:w="9360" w:type="dxa"/>
             <w:gridSpan w:val="2"/>
             <w:tcMar>
-              <w:top w:w="0" w:type="dxa"/>
+              <w:top w:w="100" w:type="dxa"/>
               <w:left w:w="0" w:type="dxa"/>
-              <w:bottom w:w="0" w:type="dxa"/>
+              <w:bottom w:w="100" w:type="dxa"/>
               <w:right w:w="0" w:type="dxa"/>
+              <w:start w:w="100" w:type="dxa"/>
+              <w:end w:w="100" w:type="dxa"/>
             </w:tcMar>
+            <w:vAlign w:val="center"/>
           </w:tcPr>
           <w:p ns2:paraId="7BEB73AC" ns2:textId="77777777">
-            <w:pPr/>
+            <w:pPr>
+              <w:spacing w:before="0" w:after="0" w:line="240" w:lineRule="auto"/>
+            </w:pPr>
             <w:r>
               <w:rPr>
                 <w:rFonts w:ascii="Arial" w:hAnsi="Arial" w:cs="Arial"/>
@@ -1053,14 +1282,19 @@
           <w:tcPr>
             <w:tcW w:w="4680" w:type="dxa"/>
             <w:tcMar>
-              <w:top w:w="0" w:type="dxa"/>
+              <w:top w:w="100" w:type="dxa"/>
               <w:left w:w="0" w:type="dxa"/>
-              <w:bottom w:w="0" w:type="dxa"/>
+              <w:bottom w:w="100" w:type="dxa"/>
               <w:right w:w="0" w:type="dxa"/>
+              <w:start w:w="100" w:type="dxa"/>
+              <w:end w:w="100" w:type="dxa"/>
             </w:tcMar>
+            <w:vAlign w:val="center"/>
           </w:tcPr>
           <w:p ns2:paraId="25F82F9A" ns2:textId="77777777">
-            <w:pPr/>
+            <w:pPr>
+              <w:spacing w:before="0" w:after="0" w:line="240" w:lineRule="auto"/>
+            </w:pPr>
             <w:r>
               <w:rPr>
                 <w:rFonts w:ascii="Arial" w:hAnsi="Arial" w:cs="Arial"/>
@@ -1075,14 +1309,19 @@
           <w:tcPr>
             <w:tcW w:w="4680" w:type="dxa"/>
             <w:tcMar>
-              <w:top w:w="0" w:type="dxa"/>
+              <w:top w:w="100" w:type="dxa"/>
               <w:left w:w="0" w:type="dxa"/>
-              <w:bottom w:w="0" w:type="dxa"/>
+              <w:bottom w:w="100" w:type="dxa"/>
               <w:right w:w="0" w:type="dxa"/>
+              <w:start w:w="100" w:type="dxa"/>
+              <w:end w:w="100" w:type="dxa"/>
             </w:tcMar>
+            <w:vAlign w:val="center"/>
           </w:tcPr>
           <w:p ns2:paraId="3D46E416" ns2:textId="77777777">
-            <w:pPr/>
+            <w:pPr>
+              <w:spacing w:before="0" w:after="0" w:line="240" w:lineRule="auto"/>
+            </w:pPr>
             <w:r>
               <w:rPr>
                 <w:rFonts w:ascii="Arial" w:hAnsi="Arial" w:cs="Arial"/>
@@ -1100,15 +1339,18 @@
             <w:tcW w:w="9360" w:type="dxa"/>
             <w:gridSpan w:val="2"/>
             <w:tcMar>
-              <w:top w:w="0" w:type="dxa"/>
+              <w:top w:w="100" w:type="dxa"/>
               <w:left w:w="0" w:type="dxa"/>
-              <w:bottom w:w="0" w:type="dxa"/>
+              <w:bottom w:w="100" w:type="dxa"/>
               <w:right w:w="0" w:type="dxa"/>
+              <w:start w:w="100" w:type="dxa"/>
+              <w:end w:w="100" w:type="dxa"/>
             </w:tcMar>
+            <w:vAlign w:val="center"/>
           </w:tcPr>
           <w:p ns2:paraId="65C72390" ns2:textId="77777777">
             <w:pPr>
-              <w:spacing w:after="120" w:line="276" w:lineRule="auto"/>
+              <w:spacing w:after="0" w:line="240" w:lineRule="auto" w:before="0"/>
             </w:pPr>
             <w:r>
               <w:rPr>
@@ -1126,14 +1368,19 @@
           <w:tcPr>
             <w:tcW w:w="4680" w:type="dxa"/>
             <w:tcMar>
-              <w:top w:w="0" w:type="dxa"/>
+              <w:top w:w="100" w:type="dxa"/>
               <w:left w:w="0" w:type="dxa"/>
-              <w:bottom w:w="0" w:type="dxa"/>
+              <w:bottom w:w="100" w:type="dxa"/>
               <w:right w:w="0" w:type="dxa"/>
+              <w:start w:w="100" w:type="dxa"/>
+              <w:end w:w="100" w:type="dxa"/>
             </w:tcMar>
+            <w:vAlign w:val="center"/>
           </w:tcPr>
           <w:p ns2:paraId="239A9B79" ns2:textId="77777777">
-            <w:pPr/>
+            <w:pPr>
+              <w:spacing w:before="0" w:after="0" w:line="240" w:lineRule="auto"/>
+            </w:pPr>
             <w:r>
               <w:rPr>
                 <w:rFonts w:ascii="Arial" w:hAnsi="Arial" w:cs="Arial"/>
@@ -1148,14 +1395,19 @@
           <w:tcPr>
             <w:tcW w:w="4680" w:type="dxa"/>
             <w:tcMar>
-              <w:top w:w="0" w:type="dxa"/>
+              <w:top w:w="100" w:type="dxa"/>
               <w:left w:w="0" w:type="dxa"/>
-              <w:bottom w:w="0" w:type="dxa"/>
+              <w:bottom w:w="100" w:type="dxa"/>
               <w:right w:w="0" w:type="dxa"/>
+              <w:start w:w="100" w:type="dxa"/>
+              <w:end w:w="100" w:type="dxa"/>
             </w:tcMar>
+            <w:vAlign w:val="center"/>
           </w:tcPr>
           <w:p ns2:paraId="7D4B31EB" ns2:textId="77777777">
-            <w:pPr/>
+            <w:pPr>
+              <w:spacing w:before="0" w:after="0" w:line="240" w:lineRule="auto"/>
+            </w:pPr>
             <w:r>
               <w:rPr>
                 <w:rFonts w:ascii="Arial" w:hAnsi="Arial" w:cs="Arial"/>
@@ -1172,14 +1424,19 @@
           <w:tcPr>
             <w:tcW w:w="4680" w:type="dxa"/>
             <w:tcMar>
-              <w:top w:w="0" w:type="dxa"/>
+              <w:top w:w="100" w:type="dxa"/>
               <w:left w:w="0" w:type="dxa"/>
-              <w:bottom w:w="0" w:type="dxa"/>
+              <w:bottom w:w="100" w:type="dxa"/>
               <w:right w:w="0" w:type="dxa"/>
+              <w:start w:w="100" w:type="dxa"/>
+              <w:end w:w="100" w:type="dxa"/>
             </w:tcMar>
+            <w:vAlign w:val="center"/>
           </w:tcPr>
           <w:p ns2:paraId="130D8F59" ns2:textId="77777777">
-            <w:pPr/>
+            <w:pPr>
+              <w:spacing w:before="0" w:after="0" w:line="240" w:lineRule="auto"/>
+            </w:pPr>
             <w:r>
               <w:rPr>
                 <w:rFonts w:ascii="Arial" w:hAnsi="Arial" w:cs="Arial"/>
@@ -1194,14 +1451,19 @@
           <w:tcPr>
             <w:tcW w:w="4680" w:type="dxa"/>
             <w:tcMar>
-              <w:top w:w="0" w:type="dxa"/>
+              <w:top w:w="100" w:type="dxa"/>
               <w:left w:w="0" w:type="dxa"/>
-              <w:bottom w:w="0" w:type="dxa"/>
+              <w:bottom w:w="100" w:type="dxa"/>
               <w:right w:w="0" w:type="dxa"/>
+              <w:start w:w="100" w:type="dxa"/>
+              <w:end w:w="100" w:type="dxa"/>
             </w:tcMar>
+            <w:vAlign w:val="center"/>
           </w:tcPr>
           <w:p ns2:paraId="0A410E45" ns2:textId="77777777">
-            <w:pPr/>
+            <w:pPr>
+              <w:spacing w:before="0" w:after="0" w:line="240" w:lineRule="auto"/>
+            </w:pPr>
             <w:r>
               <w:rPr>
                 <w:rFonts w:ascii="Arial" w:hAnsi="Arial" w:cs="Arial"/>
@@ -1214,7 +1476,13 @@
         </w:tc>
       </w:tr>
     </w:tbl>
-    <w:p ns2:paraId="65073EEC" ns2:textId="77777777"/>
+    <w:p ns2:paraId="65073EEC" ns2:textId="77777777">
+      <w:pPr>
+        <w:keepNext w:val="0"/>
+        <w:keepLines w:val="0"/>
+        <w:spacing w:before="0" w:after="0" w:line="240" w:lineRule="auto"/>
+      </w:pPr>
+    </w:p>
     <w:tbl>
       <w:tblPr>
         <w:tblStyle w:val="a4"/>
@@ -1243,14 +1511,19 @@
             <w:tcW w:w="9360" w:type="dxa"/>
             <w:shd w:val="clear" w:color="auto" w:fill="F2F2F2"/>
             <w:tcMar>
-              <w:top w:w="0" w:type="dxa"/>
+              <w:top w:w="100" w:type="dxa"/>
               <w:left w:w="0" w:type="dxa"/>
-              <w:bottom w:w="0" w:type="dxa"/>
+              <w:bottom w:w="100" w:type="dxa"/>
               <w:right w:w="0" w:type="dxa"/>
+              <w:start w:w="100" w:type="dxa"/>
+              <w:end w:w="100" w:type="dxa"/>
             </w:tcMar>
+            <w:vAlign w:val="center"/>
           </w:tcPr>
           <w:p ns2:paraId="6205E2E3" ns2:textId="77777777">
-            <w:pPr/>
+            <w:pPr>
+              <w:spacing w:before="0" w:after="0" w:line="240" w:lineRule="auto"/>
+            </w:pPr>
             <w:r>
               <w:rPr>
                 <w:rFonts w:ascii="Arial" w:hAnsi="Arial" w:cs="Arial"/>
@@ -1270,14 +1543,18 @@
           <w:tcPr>
             <w:tcW w:w="9360" w:type="dxa"/>
             <w:tcMar>
-              <w:top w:w="0" w:type="dxa"/>
+              <w:top w:w="100" w:type="dxa"/>
               <w:left w:w="0" w:type="dxa"/>
-              <w:bottom w:w="0" w:type="dxa"/>
+              <w:bottom w:w="100" w:type="dxa"/>
               <w:right w:w="0" w:type="dxa"/>
+              <w:start w:w="100" w:type="dxa"/>
+              <w:end w:w="100" w:type="dxa"/>
             </w:tcMar>
+            <w:vAlign w:val="center"/>
           </w:tcPr>
           <w:p ns2:paraId="4B01CC73" ns2:textId="77777777">
             <w:pPr>
+              <w:spacing w:before="0" w:after="0" w:line="240" w:lineRule="auto"/>
               <w:jc w:val="both"/>
             </w:pPr>
             <w:r>
@@ -1289,13 +1566,24 @@
               <w:t xml:space="preserve">{{relatorio_atividades}}</w:t>
             </w:r>
           </w:p>
-          <w:p ns2:paraId="1F0D2E79" ns2:textId="77777777"/>
-          <w:p ns2:paraId="57BC9180" ns2:textId="77777777"/>
+          <w:p ns2:paraId="1F0D2E79" ns2:textId="77777777">
+            <w:pPr>
+              <w:spacing w:before="0" w:after="0" w:line="240" w:lineRule="auto"/>
+            </w:pPr>
+          </w:p>
+          <w:p ns2:paraId="57BC9180" ns2:textId="77777777">
+            <w:pPr>
+              <w:spacing w:before="0" w:after="0" w:line="240" w:lineRule="auto"/>
+            </w:pPr>
+          </w:p>
         </w:tc>
       </w:tr>
     </w:tbl>
     <w:p ns2:paraId="02E77B2D" ns2:textId="77777777">
       <w:pPr>
+        <w:keepNext w:val="0"/>
+        <w:keepLines w:val="0"/>
+        <w:spacing w:before="0" w:after="0" w:line="240" w:lineRule="auto"/>
         <w:jc w:val="right"/>
       </w:pPr>
       <w:r>
@@ -1313,12 +1601,12 @@
         <w:tblW w:w="9360" w:type="dxa"/>
         <w:tblInd w:w="0" w:type="dxa"/>
         <w:tblBorders>
-          <w:top w:val="single" w:sz="8" w:space="0" w:color="000000"/>
-          <w:left w:val="single" w:sz="8" w:space="0" w:color="000000"/>
-          <w:bottom w:val="single" w:sz="8" w:space="0" w:color="000000"/>
-          <w:right w:val="single" w:sz="8" w:space="0" w:color="000000"/>
-          <w:insideH w:val="single" w:sz="8" w:space="0" w:color="000000"/>
-          <w:insideV w:val="single" w:sz="8" w:space="0" w:color="000000"/>
+          <w:top w:val="nil" w:sz="8" w:space="0" w:color="000000"/>
+          <w:left w:val="nil" w:sz="8" w:space="0" w:color="000000"/>
+          <w:bottom w:val="nil" w:sz="8" w:space="0" w:color="000000"/>
+          <w:right w:val="nil" w:sz="8" w:space="0" w:color="000000"/>
+          <w:insideH w:val="nil" w:sz="8" w:space="0" w:color="000000"/>
+          <w:insideV w:val="nil" w:sz="8" w:space="0" w:color="000000"/>
         </w:tblBorders>
         <w:tblLayout w:type="fixed"/>
         <w:tblLook w:val="0600" w:firstRow="0" w:lastRow="0" w:firstColumn="0" w:lastColumn="0" w:noHBand="1" w:noVBand="1"/>
@@ -1332,48 +1620,37 @@
           <w:tcPr>
             <w:tcW w:w="4680" w:type="dxa"/>
             <w:tcMar>
-              <w:top w:w="0" w:type="dxa"/>
+              <w:top w:w="100" w:type="dxa"/>
               <w:left w:w="0" w:type="dxa"/>
-              <w:bottom w:w="0" w:type="dxa"/>
+              <w:bottom w:w="100" w:type="dxa"/>
               <w:right w:w="0" w:type="dxa"/>
+              <w:start w:w="100" w:type="dxa"/>
+              <w:end w:w="100" w:type="dxa"/>
             </w:tcMar>
+            <w:vAlign w:val="center"/>
           </w:tcPr>
-          <w:p ns2:paraId="6C3B6792" ns2:textId="77777777">
-            <w:pPr>
-              <w:jc w:val="center"/>
-            </w:pPr>
-          </w:p>
-          <w:p ns2:paraId="52B7199E" ns2:textId="77777777">
-            <w:pPr>
-              <w:jc w:val="center"/>
-            </w:pPr>
-          </w:p>
-          <w:p ns2:paraId="25B9F57D" ns2:textId="77777777">
-            <w:pPr>
-              <w:jc w:val="center"/>
-            </w:pPr>
-          </w:p>
-          <w:p ns2:paraId="581477FE" ns2:textId="77777777">
-            <w:pPr>
-              <w:jc w:val="center"/>
-            </w:pPr>
-          </w:p>
-          <w:p ns2:paraId="056D0D32" ns2:textId="1BC2E3D5">
-            <w:pPr>
-              <w:jc w:val="center"/>
-            </w:pPr>
-            <w:r>
-              <w:t>____</w:t>
-            </w:r>
-            <w:r>
-              <w:t>____________________</w:t>
-            </w:r>
-          </w:p>
-          <w:p ns2:paraId="439FF236" ns2:textId="77777777">
-            <w:pPr>
-              <w:jc w:val="center"/>
-            </w:pPr>
-            <w:r>
+          <w:p>
+            <w:pPr>
+              <w:spacing w:after="40" w:line="240" w:lineRule="auto"/>
+            </w:pPr>
+            <w:r>
+              <w:rPr>
+                <w:rFonts w:ascii="Arial" w:hAnsi="Arial"/>
+                <w:sz w:val="20"/>
+              </w:rPr>
+              <w:t>______________________________</w:t>
+            </w:r>
+          </w:p>
+          <w:p>
+            <w:pPr>
+              <w:spacing w:after="0" w:line="240" w:lineRule="auto"/>
+            </w:pPr>
+            <w:r>
+              <w:rPr>
+                <w:rFonts w:ascii="Arial" w:hAnsi="Arial"/>
+                <w:b/>
+                <w:sz w:val="19"/>
+              </w:rPr>
               <w:t>Assinatura do Requerente (Aluno)</w:t>
             </w:r>
           </w:p>
@@ -1382,45 +1659,37 @@
           <w:tcPr>
             <w:tcW w:w="4680" w:type="dxa"/>
             <w:tcMar>
-              <w:top w:w="0" w:type="dxa"/>
+              <w:top w:w="100" w:type="dxa"/>
               <w:left w:w="0" w:type="dxa"/>
-              <w:bottom w:w="0" w:type="dxa"/>
+              <w:bottom w:w="100" w:type="dxa"/>
               <w:right w:w="0" w:type="dxa"/>
+              <w:start w:w="100" w:type="dxa"/>
+              <w:end w:w="100" w:type="dxa"/>
             </w:tcMar>
+            <w:vAlign w:val="center"/>
           </w:tcPr>
-          <w:p ns2:paraId="1D827C70" ns2:textId="77777777">
-            <w:pPr>
-              <w:jc w:val="center"/>
-            </w:pPr>
-          </w:p>
-          <w:p ns2:paraId="1D394149" ns2:textId="77777777">
-            <w:pPr>
-              <w:jc w:val="center"/>
-            </w:pPr>
-          </w:p>
-          <w:p ns2:paraId="192FD016" ns2:textId="77777777">
-            <w:pPr>
-              <w:jc w:val="center"/>
-            </w:pPr>
-          </w:p>
-          <w:p ns2:paraId="17328E9B" ns2:textId="77777777">
-            <w:pPr>
-              <w:jc w:val="center"/>
-            </w:pPr>
-          </w:p>
-          <w:p ns2:paraId="6A1BD12F" ns2:textId="037E3EBB">
-            <w:pPr>
-              <w:jc w:val="center"/>
-            </w:pPr>
-            <w:r>
-              <w:t>__________________</w:t>
-            </w:r>
-          </w:p>
-          <w:p ns2:paraId="4834ECE3" ns2:textId="77777777">
-            <w:pPr>
-              <w:jc w:val="center"/>
-            </w:pPr>
-            <w:r>
+          <w:p>
+            <w:pPr>
+              <w:spacing w:after="40" w:line="240" w:lineRule="auto"/>
+            </w:pPr>
+            <w:r>
+              <w:rPr>
+                <w:rFonts w:ascii="Arial" w:hAnsi="Arial"/>
+                <w:sz w:val="20"/>
+              </w:rPr>
+              <w:t>______________________________</w:t>
+            </w:r>
+          </w:p>
+          <w:p>
+            <w:pPr>
+              <w:spacing w:after="0" w:line="240" w:lineRule="auto"/>
+            </w:pPr>
+            <w:r>
+              <w:rPr>
+                <w:rFonts w:ascii="Arial" w:hAnsi="Arial"/>
+                <w:b/>
+                <w:sz w:val="19"/>
+              </w:rPr>
               <w:t>Assinatura da Chefia Imediata</w:t>
             </w:r>
           </w:p>
@@ -1429,19 +1698,25 @@
     </w:tbl>
     <w:p ns2:paraId="48E2083D" ns2:textId="77777777">
       <w:pPr>
-        <w:spacing w:after="240"/>
+        <w:keepNext w:val="0"/>
+        <w:keepLines w:val="0"/>
+        <w:spacing w:after="0" w:before="0" w:line="240" w:lineRule="auto"/>
       </w:pPr>
     </w:p>
     <w:p ns2:paraId="2262EE2B" ns2:textId="77777777">
       <w:pPr>
         <w:pStyle w:val="Ttulo3"/>
+        <w:keepNext w:val="0"/>
+        <w:keepLines w:val="0"/>
+        <w:spacing w:before="0" w:after="0" w:line="240" w:lineRule="auto"/>
       </w:pPr>
       <w:bookmarkStart w:id="1" w:name="_deati88lhw2g" w:colFirst="0" w:colLast="0"/>
       <w:bookmarkEnd w:id="1"/>
       <w:r>
         <w:rPr>
           <w:rFonts w:ascii="Arial" w:hAnsi="Arial" w:cs="Arial"/>
-          <w:sz w:val="24"/>
+          <w:b/>
+          <w:sz w:val="23"/>
           <w:szCs w:val="24"/>
         </w:rPr>
         <w:t xml:space="preserve">ANEXOS OBRIGATÓRIOS (Conforme a condição):</w:t>
@@ -1449,11 +1724,13 @@
     </w:p>
     <w:p ns2:paraId="4857B193" ns2:textId="77777777">
       <w:pPr>
+        <w:keepNext w:val="0"/>
+        <w:keepLines w:val="0"/>
         <w:numPr>
           <w:ilvl w:val="0"/>
           <w:numId w:val="2"/>
         </w:numPr>
-        <w:spacing w:after="120" w:line="276" w:lineRule="auto"/>
+        <w:spacing w:after="0" w:line="240" w:lineRule="auto" w:before="0"/>
       </w:pPr>
       <w:r>
         <w:rPr>
@@ -1476,10 +1753,13 @@
     </w:p>
     <w:p ns2:paraId="674438F4" ns2:textId="77777777">
       <w:pPr>
+        <w:keepNext w:val="0"/>
+        <w:keepLines w:val="0"/>
         <w:numPr>
           <w:ilvl w:val="0"/>
           <w:numId w:val="2"/>
         </w:numPr>
+        <w:spacing w:before="0" w:after="0" w:line="240" w:lineRule="auto"/>
       </w:pPr>
       <w:r>
         <w:rPr>
@@ -1510,10 +1790,13 @@
     </w:p>
     <w:p ns2:paraId="3F49DFB4" ns2:textId="77777777">
       <w:pPr>
+        <w:keepNext w:val="0"/>
+        <w:keepLines w:val="0"/>
         <w:numPr>
           <w:ilvl w:val="0"/>
           <w:numId w:val="2"/>
         </w:numPr>
+        <w:spacing w:before="0" w:after="0" w:line="240" w:lineRule="auto"/>
       </w:pPr>
       <w:r>
         <w:rPr>
@@ -1536,10 +1819,13 @@
     </w:p>
     <w:p ns2:paraId="1017C7EC" ns2:textId="77777777">
       <w:pPr>
+        <w:keepNext w:val="0"/>
+        <w:keepLines w:val="0"/>
         <w:numPr>
           <w:ilvl w:val="0"/>
           <w:numId w:val="2"/>
         </w:numPr>
+        <w:spacing w:before="0" w:after="0" w:line="240" w:lineRule="auto"/>
       </w:pPr>
       <w:r>
         <w:rPr>
@@ -1560,7 +1846,13 @@
         <w:t xml:space="preserve"/>
       </w:r>
     </w:p>
-    <w:p ns2:paraId="7B5D5FCE" ns2:textId="77777777"/>
+    <w:p ns2:paraId="7B5D5FCE" ns2:textId="77777777">
+      <w:pPr>
+        <w:keepNext w:val="0"/>
+        <w:keepLines w:val="0"/>
+        <w:spacing w:before="0" w:after="0" w:line="240" w:lineRule="auto"/>
+      </w:pPr>
+    </w:p>
     <w:tbl>
       <w:tblPr>
         <w:tblStyle w:val="a6"/>
@@ -1591,14 +1883,18 @@
             <w:gridSpan w:val="2"/>
             <w:shd w:val="clear" w:color="auto" w:fill="D9D9D9"/>
             <w:tcMar>
-              <w:top w:w="0" w:type="dxa"/>
+              <w:top w:w="100" w:type="dxa"/>
               <w:left w:w="0" w:type="dxa"/>
-              <w:bottom w:w="0" w:type="dxa"/>
+              <w:bottom w:w="100" w:type="dxa"/>
               <w:right w:w="0" w:type="dxa"/>
+              <w:start w:w="100" w:type="dxa"/>
+              <w:end w:w="100" w:type="dxa"/>
             </w:tcMar>
+            <w:vAlign w:val="center"/>
           </w:tcPr>
           <w:p ns2:paraId="48314F15" ns2:textId="77777777">
             <w:pPr>
+              <w:spacing w:before="0" w:after="0" w:line="240" w:lineRule="auto"/>
               <w:rPr>
                 <w:b/>
                 <w:bCs/>
@@ -1623,14 +1919,19 @@
             <w:tcW w:w="9360" w:type="dxa"/>
             <w:gridSpan w:val="2"/>
             <w:tcMar>
-              <w:top w:w="0" w:type="dxa"/>
+              <w:top w:w="100" w:type="dxa"/>
               <w:left w:w="0" w:type="dxa"/>
-              <w:bottom w:w="0" w:type="dxa"/>
+              <w:bottom w:w="100" w:type="dxa"/>
               <w:right w:w="0" w:type="dxa"/>
+              <w:start w:w="100" w:type="dxa"/>
+              <w:end w:w="100" w:type="dxa"/>
             </w:tcMar>
+            <w:vAlign w:val="center"/>
           </w:tcPr>
           <w:p ns2:paraId="55DB4263" ns2:textId="77777777">
-            <w:pPr/>
+            <w:pPr>
+              <w:spacing w:before="0" w:after="0" w:line="240" w:lineRule="auto"/>
+            </w:pPr>
             <w:r>
               <w:rPr>
                 <w:rFonts w:ascii="Arial" w:hAnsi="Arial" w:cs="Arial"/>
@@ -1669,14 +1970,24 @@
             <w:tcW w:w="9360" w:type="dxa"/>
             <w:gridSpan w:val="2"/>
             <w:tcMar>
-              <w:top w:w="0" w:type="dxa"/>
+              <w:top w:w="100" w:type="dxa"/>
               <w:left w:w="0" w:type="dxa"/>
-              <w:bottom w:w="0" w:type="dxa"/>
+              <w:bottom w:w="100" w:type="dxa"/>
               <w:right w:w="0" w:type="dxa"/>
+              <w:start w:w="100" w:type="dxa"/>
+              <w:end w:w="100" w:type="dxa"/>
             </w:tcMar>
+            <w:vAlign w:val="center"/>
           </w:tcPr>
           <w:p ns2:paraId="18628682" ns2:textId="77777777">
-            <w:r>
+            <w:pPr>
+              <w:spacing w:before="0" w:after="0" w:line="240" w:lineRule="auto"/>
+            </w:pPr>
+            <w:r>
+              <w:rPr>
+                <w:rFonts w:ascii="Arial" w:hAnsi="Arial"/>
+                <w:sz w:val="21"/>
+              </w:rPr>
               <w:t>Observações:</w:t>
             </w:r>
           </w:p>
@@ -1687,14 +1998,18 @@
           <w:tcPr>
             <w:tcW w:w="4680" w:type="dxa"/>
             <w:tcMar>
-              <w:top w:w="0" w:type="dxa"/>
+              <w:top w:w="100" w:type="dxa"/>
               <w:left w:w="0" w:type="dxa"/>
-              <w:bottom w:w="0" w:type="dxa"/>
+              <w:bottom w:w="100" w:type="dxa"/>
               <w:right w:w="0" w:type="dxa"/>
+              <w:start w:w="100" w:type="dxa"/>
+              <w:end w:w="100" w:type="dxa"/>
             </w:tcMar>
+            <w:vAlign w:val="center"/>
           </w:tcPr>
           <w:p ns2:paraId="1BFDD426" ns2:textId="77777777">
             <w:pPr>
+              <w:spacing w:before="0" w:after="0" w:line="240" w:lineRule="auto"/>
               <w:rPr>
                 <w:b/>
                 <w:bCs/>
@@ -1702,29 +2017,53 @@
             </w:pPr>
             <w:r>
               <w:rPr>
+                <w:rFonts w:ascii="Arial" w:hAnsi="Arial"/>
                 <w:b/>
                 <w:bCs/>
+                <w:sz w:val="21"/>
               </w:rPr>
               <w:t>Parecer Final:</w:t>
             </w:r>
           </w:p>
           <w:p ns2:paraId="73C068AE" ns2:textId="77777777">
+            <w:pPr>
+              <w:spacing w:before="0" w:after="0" w:line="240" w:lineRule="auto"/>
+            </w:pPr>
             <w:proofErr w:type="gramStart"/>
             <w:r>
+              <w:rPr>
+                <w:rFonts w:ascii="Arial" w:hAnsi="Arial"/>
+                <w:sz w:val="21"/>
+              </w:rPr>
               <w:t>( )</w:t>
             </w:r>
             <w:proofErr w:type="gramEnd"/>
             <w:r>
+              <w:rPr>
+                <w:rFonts w:ascii="Arial" w:hAnsi="Arial"/>
+                <w:sz w:val="21"/>
+              </w:rPr>
               <w:t xml:space="preserve"> Deferido</w:t>
             </w:r>
           </w:p>
           <w:p ns2:paraId="377CC1DD" ns2:textId="77777777">
+            <w:pPr>
+              <w:spacing w:before="0" w:after="0" w:line="240" w:lineRule="auto"/>
+            </w:pPr>
             <w:proofErr w:type="gramStart"/>
             <w:r>
+              <w:rPr>
+                <w:rFonts w:ascii="Arial" w:hAnsi="Arial"/>
+                <w:sz w:val="21"/>
+              </w:rPr>
               <w:t>( )</w:t>
             </w:r>
             <w:proofErr w:type="gramEnd"/>
             <w:r>
+              <w:rPr>
+                <w:rFonts w:ascii="Arial" w:hAnsi="Arial"/>
+                <w:sz w:val="21"/>
+              </w:rPr>
               <w:t xml:space="preserve"> Indeferido</w:t>
             </w:r>
           </w:p>
@@ -1733,14 +2072,18 @@
           <w:tcPr>
             <w:tcW w:w="4680" w:type="dxa"/>
             <w:tcMar>
-              <w:top w:w="0" w:type="dxa"/>
+              <w:top w:w="100" w:type="dxa"/>
               <w:left w:w="0" w:type="dxa"/>
-              <w:bottom w:w="0" w:type="dxa"/>
+              <w:bottom w:w="100" w:type="dxa"/>
               <w:right w:w="0" w:type="dxa"/>
+              <w:start w:w="100" w:type="dxa"/>
+              <w:end w:w="100" w:type="dxa"/>
             </w:tcMar>
+            <w:vAlign w:val="center"/>
           </w:tcPr>
           <w:p ns2:paraId="48260F48" ns2:textId="77777777">
             <w:pPr>
+              <w:spacing w:before="0" w:after="0" w:line="240" w:lineRule="auto"/>
               <w:rPr>
                 <w:b/>
                 <w:bCs/>
@@ -1758,7 +2101,9 @@
             </w:r>
           </w:p>
           <w:p ns2:paraId="77250862" ns2:textId="77777777">
-            <w:pPr/>
+            <w:pPr>
+              <w:spacing w:before="0" w:after="0" w:line="240" w:lineRule="auto"/>
+            </w:pPr>
             <w:proofErr w:type="gramStart"/>
             <w:r>
               <w:rPr>
@@ -1779,7 +2124,9 @@
             </w:r>
           </w:p>
           <w:p ns2:paraId="62BF7F86" ns2:textId="77777777">
-            <w:pPr/>
+            <w:pPr>
+              <w:spacing w:before="0" w:after="0" w:line="240" w:lineRule="auto"/>
+            </w:pPr>
             <w:proofErr w:type="gramStart"/>
             <w:r>
               <w:rPr>
@@ -1804,52 +2151,86 @@
     </w:tbl>
     <w:p ns2:paraId="08ECAEEA" ns2:textId="77777777">
       <w:pPr>
+        <w:keepNext w:val="0"/>
+        <w:keepLines w:val="0"/>
+        <w:spacing w:before="0" w:after="0" w:line="240" w:lineRule="auto"/>
         <w:jc w:val="center"/>
       </w:pPr>
     </w:p>
     <w:p ns2:paraId="7AFF0AD1" ns2:textId="77777777">
       <w:pPr>
+        <w:keepNext w:val="0"/>
+        <w:keepLines w:val="0"/>
+        <w:spacing w:before="0" w:after="0" w:line="240" w:lineRule="auto"/>
         <w:jc w:val="center"/>
       </w:pPr>
     </w:p>
     <w:p ns2:paraId="254EDC87" ns2:textId="77777777">
       <w:pPr>
+        <w:keepNext w:val="0"/>
+        <w:keepLines w:val="0"/>
+        <w:spacing w:before="0" w:after="0" w:line="240" w:lineRule="auto"/>
         <w:jc w:val="center"/>
       </w:pPr>
     </w:p>
     <w:p ns2:paraId="5D6EF065" ns2:textId="77777777">
       <w:pPr>
+        <w:keepNext w:val="0"/>
+        <w:keepLines w:val="0"/>
+        <w:spacing w:before="0" w:after="0" w:line="240" w:lineRule="auto"/>
         <w:jc w:val="center"/>
       </w:pPr>
     </w:p>
     <w:p ns2:paraId="04094C3B" ns2:textId="77777777">
       <w:pPr>
+        <w:keepNext w:val="0"/>
+        <w:keepLines w:val="0"/>
+        <w:spacing w:before="0" w:after="0" w:line="240" w:lineRule="auto"/>
         <w:jc w:val="center"/>
       </w:pPr>
     </w:p>
     <w:p ns2:paraId="73BE185F" ns2:textId="77777777">
       <w:pPr>
+        <w:keepNext w:val="0"/>
+        <w:keepLines w:val="0"/>
+        <w:spacing w:before="0" w:after="0" w:line="240" w:lineRule="auto"/>
         <w:jc w:val="center"/>
       </w:pPr>
     </w:p>
     <w:p ns2:paraId="5EB9E367" ns2:textId="77777777">
       <w:pPr>
+        <w:keepNext w:val="0"/>
+        <w:keepLines w:val="0"/>
+        <w:spacing w:before="0" w:after="0" w:line="240" w:lineRule="auto"/>
         <w:jc w:val="center"/>
       </w:pPr>
       <w:r>
+        <w:rPr>
+          <w:rFonts w:ascii="Arial" w:hAnsi="Arial"/>
+          <w:sz w:val="21"/>
+        </w:rPr>
         <w:t>____________________________</w:t>
       </w:r>
     </w:p>
     <w:p ns2:paraId="1C55E007" ns2:textId="77777777">
       <w:pPr>
+        <w:keepNext w:val="0"/>
+        <w:keepLines w:val="0"/>
+        <w:spacing w:before="0" w:after="0" w:line="240" w:lineRule="auto"/>
         <w:jc w:val="center"/>
       </w:pPr>
       <w:r>
+        <w:rPr>
+          <w:rFonts w:ascii="Arial" w:hAnsi="Arial"/>
+          <w:sz w:val="21"/>
+        </w:rPr>
         <w:t>Assinatura e Carimbo do Coordenador/Orientador</w:t>
       </w:r>
     </w:p>
     <w:p ns2:paraId="25803ED1" ns2:textId="77777777">
       <w:pPr>
+        <w:keepNext w:val="0"/>
+        <w:keepLines w:val="0"/>
         <w:pBdr>
           <w:top w:val="nil"/>
           <w:left w:val="nil"/>
@@ -1857,7 +2238,7 @@
           <w:right w:val="nil"/>
           <w:between w:val="nil"/>
         </w:pBdr>
-        <w:spacing w:line="360" w:lineRule="auto"/>
+        <w:spacing w:line="240" w:lineRule="auto" w:before="0" w:after="0"/>
         <w:rPr>
           <w:i/>
           <w:iCs/>
@@ -1866,15 +2247,22 @@
         </w:rPr>
       </w:pPr>
       <w:r>
+        <w:rPr>
+          <w:rFonts w:ascii="Arial" w:hAnsi="Arial"/>
+          <w:sz w:val="21"/>
+        </w:rPr>
         <w:br w:type="page"/>
       </w:r>
     </w:p>
     <w:p ns2:paraId="491F911C" ns2:textId="491FE940">
       <w:pPr>
+        <w:keepNext w:val="0"/>
+        <w:keepLines w:val="0"/>
         <w:tabs>
           <w:tab w:val="left" w:pos="1300"/>
           <w:tab w:val="left" w:pos="6820"/>
         </w:tabs>
+        <w:spacing w:before="0" w:after="0" w:line="240" w:lineRule="auto"/>
         <w:jc w:val="both"/>
         <w:rPr>
           <w:sz w:val="28"/>
@@ -3248,6 +3636,13 @@
   <w:style w:type="paragraph" w:default="1" w:styleId="Normal">
     <w:name w:val="Normal"/>
     <w:qFormat/>
+    <w:pPr>
+      <w:spacing w:before="0" w:after="0" w:line="240" w:lineRule="auto"/>
+    </w:pPr>
+    <w:rPr>
+      <w:rFonts w:ascii="Arial" w:hAnsi="Arial"/>
+      <w:sz w:val="21"/>
+    </w:rPr>
   </w:style>
   <w:style w:type="paragraph" w:styleId="Ttulo1">
     <w:name w:val="heading 1"/>
@@ -3263,7 +3658,7 @@
         <w:right w:val="nil"/>
         <w:between w:val="nil"/>
       </w:pBdr>
-      <w:spacing w:before="240" w:after="240"/>
+      <w:spacing w:before="0" w:after="0" w:line="240" w:lineRule="auto"/>
       <w:outlineLvl w:val="0"/>
     </w:pPr>
     <w:rPr>
@@ -3288,7 +3683,7 @@
         <w:right w:val="nil"/>
         <w:between w:val="nil"/>
       </w:pBdr>
-      <w:spacing w:before="225" w:after="225"/>
+      <w:spacing w:before="0" w:after="0" w:line="240" w:lineRule="auto"/>
       <w:outlineLvl w:val="1"/>
     </w:pPr>
     <w:rPr>
@@ -3313,7 +3708,7 @@
         <w:right w:val="nil"/>
         <w:between w:val="nil"/>
       </w:pBdr>
-      <w:spacing w:before="240" w:after="240"/>
+      <w:spacing w:before="0" w:after="0" w:line="240" w:lineRule="auto"/>
       <w:outlineLvl w:val="2"/>
     </w:pPr>
     <w:rPr>
@@ -3339,7 +3734,7 @@
         <w:right w:val="nil"/>
         <w:between w:val="nil"/>
       </w:pBdr>
-      <w:spacing w:before="255" w:after="255"/>
+      <w:spacing w:before="0" w:after="0" w:line="240" w:lineRule="auto"/>
       <w:outlineLvl w:val="3"/>
     </w:pPr>
     <w:rPr>
@@ -3365,7 +3760,7 @@
         <w:right w:val="nil"/>
         <w:between w:val="nil"/>
       </w:pBdr>
-      <w:spacing w:before="255" w:after="255"/>
+      <w:spacing w:before="0" w:after="0" w:line="240" w:lineRule="auto"/>
       <w:outlineLvl w:val="4"/>
     </w:pPr>
     <w:rPr>
@@ -3391,7 +3786,7 @@
         <w:right w:val="nil"/>
         <w:between w:val="nil"/>
       </w:pBdr>
-      <w:spacing w:before="360" w:after="360"/>
+      <w:spacing w:before="0" w:after="0" w:line="240" w:lineRule="auto"/>
       <w:outlineLvl w:val="5"/>
     </w:pPr>
     <w:rPr>
@@ -3448,7 +3843,7 @@
     <w:pPr>
       <w:keepNext/>
       <w:keepLines/>
-      <w:spacing w:before="480" w:after="120"/>
+      <w:spacing w:before="0" w:after="0" w:line="240" w:lineRule="auto"/>
     </w:pPr>
     <w:rPr>
       <w:b/>
@@ -3466,7 +3861,7 @@
     <w:pPr>
       <w:keepNext/>
       <w:keepLines/>
-      <w:spacing w:before="360" w:after="80"/>
+      <w:spacing w:before="0" w:after="0" w:line="240" w:lineRule="auto"/>
     </w:pPr>
     <w:rPr>
       <w:rFonts w:ascii="Georgia" w:eastAsia="Georgia" w:hAnsi="Georgia" w:cs="Georgia"/>

</xml_diff>